<commit_message>
modified:   "1 semestre/BD/Aula 6/Exerc\303\255cio 1.brM3" 	modified:   "1 semestre/PA/Algoritmo de decis\303\243o part2/Diagramas/Atividade 6.fprg" 	modified:   1 semestre/PA/Algoritmos de Dados/Diagramas/Atividade 4.graphml 	modified:   1 semestre/PA/Algoritmos de Dados/Diagramas/Atividade 9.graphml 	modified:   "1 semestre/PA/Algoritmos de repeti\303\247\303\243o for/Diagrama/Atividade 7.fprg" 	modified:   1 semestre/PA/Willian Raphael/Diagramas/Atividade 7.fprg 	modified:   "2 semestre/CeN/Computa\303\247\303\243o em Nuvem.docx" 	modified:   2 semestre/CeN/Empresa de varejo.docx 	modified:   2 semestre/Mobile/Atividade6/cadastro.dart 	modified:   2 semestre/Mobile/Atividade6/index.dart 	modified:   2 semestre/SW/Atividade_3/Tela.php
</commit_message>
<xml_diff>
--- a/2 semestre/CeN/Computação em Nuvem.docx
+++ b/2 semestre/CeN/Computação em Nuvem.docx
@@ -603,577 +603,6 @@
     </w:sectPr>
   </w:body>
 </w:document>
-</file>
-
-<file path=word/styles.xml><?xml version="1.0" encoding="utf-8"?>
-<w:styles xmlns:mc="http://schemas.openxmlformats.org/markup-compatibility/2006" xmlns:r="http://schemas.openxmlformats.org/officeDocument/2006/relationships" xmlns:w="http://schemas.openxmlformats.org/wordprocessingml/2006/main" xmlns:w14="http://schemas.microsoft.com/office/word/2010/wordml" xmlns:w15="http://schemas.microsoft.com/office/word/2012/wordml" xmlns:w16se="http://schemas.microsoft.com/office/word/2015/wordml/symex" mc:Ignorable="w14 w15 w16se">
-  <w:docDefaults>
-    <w:rPrDefault>
-      <w:rPr>
-        <w:rFonts w:asciiTheme="minorHAnsi" w:eastAsiaTheme="minorHAnsi" w:hAnsiTheme="minorHAnsi" w:cstheme="minorBidi"/>
-        <w:sz w:val="22"/>
-        <w:szCs w:val="22"/>
-        <w:lang w:val="pt-BR" w:eastAsia="en-US" w:bidi="ar-SA"/>
-      </w:rPr>
-    </w:rPrDefault>
-    <w:pPrDefault>
-      <w:pPr>
-        <w:spacing w:after="160" w:line="259" w:lineRule="auto"/>
-      </w:pPr>
-    </w:pPrDefault>
-  </w:docDefaults>
-  <w:latentStyles w:defLockedState="0" w:defUIPriority="99" w:defSemiHidden="0" w:defUnhideWhenUsed="0" w:defQFormat="0" w:count="371">
-    <w:lsdException w:name="Normal" w:uiPriority="0" w:qFormat="1"/>
-    <w:lsdException w:name="heading 1" w:uiPriority="9" w:qFormat="1"/>
-    <w:lsdException w:name="heading 2" w:semiHidden="1" w:uiPriority="9" w:unhideWhenUsed="1" w:qFormat="1"/>
-    <w:lsdException w:name="heading 3" w:semiHidden="1" w:uiPriority="9" w:unhideWhenUsed="1" w:qFormat="1"/>
-    <w:lsdException w:name="heading 4" w:semiHidden="1" w:uiPriority="9" w:unhideWhenUsed="1" w:qFormat="1"/>
-    <w:lsdException w:name="heading 5" w:semiHidden="1" w:uiPriority="9" w:unhideWhenUsed="1" w:qFormat="1"/>
-    <w:lsdException w:name="heading 6" w:semiHidden="1" w:uiPriority="9" w:unhideWhenUsed="1" w:qFormat="1"/>
-    <w:lsdException w:name="heading 7" w:semiHidden="1" w:uiPriority="9" w:unhideWhenUsed="1" w:qFormat="1"/>
-    <w:lsdException w:name="heading 8" w:semiHidden="1" w:uiPriority="9" w:unhideWhenUsed="1" w:qFormat="1"/>
-    <w:lsdException w:name="heading 9" w:semiHidden="1" w:uiPriority="9" w:unhideWhenUsed="1" w:qFormat="1"/>
-    <w:lsdException w:name="index 1" w:semiHidden="1" w:unhideWhenUsed="1"/>
-    <w:lsdException w:name="index 2" w:semiHidden="1" w:unhideWhenUsed="1"/>
-    <w:lsdException w:name="index 3" w:semiHidden="1" w:unhideWhenUsed="1"/>
-    <w:lsdException w:name="index 4" w:semiHidden="1" w:unhideWhenUsed="1"/>
-    <w:lsdException w:name="index 5" w:semiHidden="1" w:unhideWhenUsed="1"/>
-    <w:lsdException w:name="index 6" w:semiHidden="1" w:unhideWhenUsed="1"/>
-    <w:lsdException w:name="index 7" w:semiHidden="1" w:unhideWhenUsed="1"/>
-    <w:lsdException w:name="index 8" w:semiHidden="1" w:unhideWhenUsed="1"/>
-    <w:lsdException w:name="index 9" w:semiHidden="1" w:unhideWhenUsed="1"/>
-    <w:lsdException w:name="toc 1" w:semiHidden="1" w:uiPriority="39" w:unhideWhenUsed="1"/>
-    <w:lsdException w:name="toc 2" w:semiHidden="1" w:uiPriority="39" w:unhideWhenUsed="1"/>
-    <w:lsdException w:name="toc 3" w:semiHidden="1" w:uiPriority="39" w:unhideWhenUsed="1"/>
-    <w:lsdException w:name="toc 4" w:semiHidden="1" w:uiPriority="39" w:unhideWhenUsed="1"/>
-    <w:lsdException w:name="toc 5" w:semiHidden="1" w:uiPriority="39" w:unhideWhenUsed="1"/>
-    <w:lsdException w:name="toc 6" w:semiHidden="1" w:uiPriority="39" w:unhideWhenUsed="1"/>
-    <w:lsdException w:name="toc 7" w:semiHidden="1" w:uiPriority="39" w:unhideWhenUsed="1"/>
-    <w:lsdException w:name="toc 8" w:semiHidden="1" w:uiPriority="39" w:unhideWhenUsed="1"/>
-    <w:lsdException w:name="toc 9" w:semiHidden="1" w:uiPriority="39" w:unhideWhenUsed="1"/>
-    <w:lsdException w:name="Normal Indent" w:semiHidden="1" w:unhideWhenUsed="1"/>
-    <w:lsdException w:name="footnote text" w:semiHidden="1" w:unhideWhenUsed="1"/>
-    <w:lsdException w:name="annotation text" w:semiHidden="1" w:unhideWhenUsed="1"/>
-    <w:lsdException w:name="header" w:semiHidden="1" w:unhideWhenUsed="1"/>
-    <w:lsdException w:name="footer" w:semiHidden="1" w:unhideWhenUsed="1"/>
-    <w:lsdException w:name="index heading" w:semiHidden="1" w:unhideWhenUsed="1"/>
-    <w:lsdException w:name="caption" w:semiHidden="1" w:uiPriority="35" w:unhideWhenUsed="1" w:qFormat="1"/>
-    <w:lsdException w:name="table of figures" w:semiHidden="1" w:unhideWhenUsed="1"/>
-    <w:lsdException w:name="envelope address" w:semiHidden="1" w:unhideWhenUsed="1"/>
-    <w:lsdException w:name="envelope return" w:semiHidden="1" w:unhideWhenUsed="1"/>
-    <w:lsdException w:name="footnote reference" w:semiHidden="1" w:unhideWhenUsed="1"/>
-    <w:lsdException w:name="annotation reference" w:semiHidden="1" w:unhideWhenUsed="1"/>
-    <w:lsdException w:name="line number" w:semiHidden="1" w:unhideWhenUsed="1"/>
-    <w:lsdException w:name="page number" w:semiHidden="1" w:unhideWhenUsed="1"/>
-    <w:lsdException w:name="endnote reference" w:semiHidden="1" w:unhideWhenUsed="1"/>
-    <w:lsdException w:name="endnote text" w:semiHidden="1" w:unhideWhenUsed="1"/>
-    <w:lsdException w:name="table of authorities" w:semiHidden="1" w:unhideWhenUsed="1"/>
-    <w:lsdException w:name="macro" w:semiHidden="1" w:unhideWhenUsed="1"/>
-    <w:lsdException w:name="toa heading" w:semiHidden="1" w:unhideWhenUsed="1"/>
-    <w:lsdException w:name="List" w:semiHidden="1" w:unhideWhenUsed="1"/>
-    <w:lsdException w:name="List Bullet" w:semiHidden="1" w:unhideWhenUsed="1"/>
-    <w:lsdException w:name="List Number" w:semiHidden="1" w:unhideWhenUsed="1"/>
-    <w:lsdException w:name="List 2" w:semiHidden="1" w:unhideWhenUsed="1"/>
-    <w:lsdException w:name="List 3" w:semiHidden="1" w:unhideWhenUsed="1"/>
-    <w:lsdException w:name="List 4" w:semiHidden="1" w:unhideWhenUsed="1"/>
-    <w:lsdException w:name="List 5" w:semiHidden="1" w:unhideWhenUsed="1"/>
-    <w:lsdException w:name="List Bullet 2" w:semiHidden="1" w:unhideWhenUsed="1"/>
-    <w:lsdException w:name="List Bullet 3" w:semiHidden="1" w:unhideWhenUsed="1"/>
-    <w:lsdException w:name="List Bullet 4" w:semiHidden="1" w:unhideWhenUsed="1"/>
-    <w:lsdException w:name="List Bullet 5" w:semiHidden="1" w:unhideWhenUsed="1"/>
-    <w:lsdException w:name="List Number 2" w:semiHidden="1" w:unhideWhenUsed="1"/>
-    <w:lsdException w:name="List Number 3" w:semiHidden="1" w:unhideWhenUsed="1"/>
-    <w:lsdException w:name="List Number 4" w:semiHidden="1" w:unhideWhenUsed="1"/>
-    <w:lsdException w:name="List Number 5" w:semiHidden="1" w:unhideWhenUsed="1"/>
-    <w:lsdException w:name="Title" w:uiPriority="10" w:qFormat="1"/>
-    <w:lsdException w:name="Closing" w:semiHidden="1" w:unhideWhenUsed="1"/>
-    <w:lsdException w:name="Signature" w:semiHidden="1" w:unhideWhenUsed="1"/>
-    <w:lsdException w:name="Default Paragraph Font" w:semiHidden="1" w:uiPriority="1" w:unhideWhenUsed="1"/>
-    <w:lsdException w:name="Body Text" w:semiHidden="1" w:unhideWhenUsed="1"/>
-    <w:lsdException w:name="Body Text Indent" w:semiHidden="1" w:unhideWhenUsed="1"/>
-    <w:lsdException w:name="List Continue" w:semiHidden="1" w:unhideWhenUsed="1"/>
-    <w:lsdException w:name="List Continue 2" w:semiHidden="1" w:unhideWhenUsed="1"/>
-    <w:lsdException w:name="List Continue 3" w:semiHidden="1" w:unhideWhenUsed="1"/>
-    <w:lsdException w:name="List Continue 4" w:semiHidden="1" w:unhideWhenUsed="1"/>
-    <w:lsdException w:name="List Continue 5" w:semiHidden="1" w:unhideWhenUsed="1"/>
-    <w:lsdException w:name="Message Header" w:semiHidden="1" w:unhideWhenUsed="1"/>
-    <w:lsdException w:name="Subtitle" w:uiPriority="11" w:qFormat="1"/>
-    <w:lsdException w:name="Salutation" w:semiHidden="1" w:unhideWhenUsed="1"/>
-    <w:lsdException w:name="Date" w:semiHidden="1" w:unhideWhenUsed="1"/>
-    <w:lsdException w:name="Body Text First Indent" w:semiHidden="1" w:unhideWhenUsed="1"/>
-    <w:lsdException w:name="Body Text First Indent 2" w:semiHidden="1" w:unhideWhenUsed="1"/>
-    <w:lsdException w:name="Note Heading" w:semiHidden="1" w:unhideWhenUsed="1"/>
-    <w:lsdException w:name="Body Text 2" w:semiHidden="1" w:unhideWhenUsed="1"/>
-    <w:lsdException w:name="Body Text 3" w:semiHidden="1" w:unhideWhenUsed="1"/>
-    <w:lsdException w:name="Body Text Indent 2" w:semiHidden="1" w:unhideWhenUsed="1"/>
-    <w:lsdException w:name="Body Text Indent 3" w:semiHidden="1" w:unhideWhenUsed="1"/>
-    <w:lsdException w:name="Block Text" w:semiHidden="1" w:unhideWhenUsed="1"/>
-    <w:lsdException w:name="Hyperlink" w:semiHidden="1" w:unhideWhenUsed="1"/>
-    <w:lsdException w:name="FollowedHyperlink" w:semiHidden="1" w:unhideWhenUsed="1"/>
-    <w:lsdException w:name="Strong" w:uiPriority="22" w:qFormat="1"/>
-    <w:lsdException w:name="Emphasis" w:uiPriority="20" w:qFormat="1"/>
-    <w:lsdException w:name="Document Map" w:semiHidden="1" w:unhideWhenUsed="1"/>
-    <w:lsdException w:name="Plain Text" w:semiHidden="1" w:unhideWhenUsed="1"/>
-    <w:lsdException w:name="E-mail Signature" w:semiHidden="1" w:unhideWhenUsed="1"/>
-    <w:lsdException w:name="HTML Top of Form" w:semiHidden="1" w:unhideWhenUsed="1"/>
-    <w:lsdException w:name="HTML Bottom of Form" w:semiHidden="1" w:unhideWhenUsed="1"/>
-    <w:lsdException w:name="Normal (Web)" w:semiHidden="1" w:unhideWhenUsed="1"/>
-    <w:lsdException w:name="HTML Acronym" w:semiHidden="1" w:unhideWhenUsed="1"/>
-    <w:lsdException w:name="HTML Address" w:semiHidden="1" w:unhideWhenUsed="1"/>
-    <w:lsdException w:name="HTML Cite" w:semiHidden="1" w:unhideWhenUsed="1"/>
-    <w:lsdException w:name="HTML Code" w:semiHidden="1" w:unhideWhenUsed="1"/>
-    <w:lsdException w:name="HTML Definition" w:semiHidden="1" w:unhideWhenUsed="1"/>
-    <w:lsdException w:name="HTML Keyboard" w:semiHidden="1" w:unhideWhenUsed="1"/>
-    <w:lsdException w:name="HTML Preformatted" w:semiHidden="1" w:unhideWhenUsed="1"/>
-    <w:lsdException w:name="HTML Sample" w:semiHidden="1" w:unhideWhenUsed="1"/>
-    <w:lsdException w:name="HTML Typewriter" w:semiHidden="1" w:unhideWhenUsed="1"/>
-    <w:lsdException w:name="HTML Variable" w:semiHidden="1" w:unhideWhenUsed="1"/>
-    <w:lsdException w:name="Normal Table" w:semiHidden="1" w:unhideWhenUsed="1"/>
-    <w:lsdException w:name="annotation subject" w:semiHidden="1" w:unhideWhenUsed="1"/>
-    <w:lsdException w:name="No List" w:semiHidden="1" w:unhideWhenUsed="1"/>
-    <w:lsdException w:name="Outline List 1" w:semiHidden="1" w:unhideWhenUsed="1"/>
-    <w:lsdException w:name="Outline List 2" w:semiHidden="1" w:unhideWhenUsed="1"/>
-    <w:lsdException w:name="Outline List 3" w:semiHidden="1" w:unhideWhenUsed="1"/>
-    <w:lsdException w:name="Table Simple 1" w:semiHidden="1" w:unhideWhenUsed="1"/>
-    <w:lsdException w:name="Table Simple 2" w:semiHidden="1" w:unhideWhenUsed="1"/>
-    <w:lsdException w:name="Table Simple 3" w:semiHidden="1" w:unhideWhenUsed="1"/>
-    <w:lsdException w:name="Table Classic 1" w:semiHidden="1" w:unhideWhenUsed="1"/>
-    <w:lsdException w:name="Table Classic 2" w:semiHidden="1" w:unhideWhenUsed="1"/>
-    <w:lsdException w:name="Table Classic 3" w:semiHidden="1" w:unhideWhenUsed="1"/>
-    <w:lsdException w:name="Table Classic 4" w:semiHidden="1" w:unhideWhenUsed="1"/>
-    <w:lsdException w:name="Table Colorful 1" w:semiHidden="1" w:unhideWhenUsed="1"/>
-    <w:lsdException w:name="Table Colorful 2" w:semiHidden="1" w:unhideWhenUsed="1"/>
-    <w:lsdException w:name="Table Colorful 3" w:semiHidden="1" w:unhideWhenUsed="1"/>
-    <w:lsdException w:name="Table Columns 1" w:semiHidden="1" w:unhideWhenUsed="1"/>
-    <w:lsdException w:name="Table Columns 2" w:semiHidden="1" w:unhideWhenUsed="1"/>
-    <w:lsdException w:name="Table Columns 3" w:semiHidden="1" w:unhideWhenUsed="1"/>
-    <w:lsdException w:name="Table Columns 4" w:semiHidden="1" w:unhideWhenUsed="1"/>
-    <w:lsdException w:name="Table Columns 5" w:semiHidden="1" w:unhideWhenUsed="1"/>
-    <w:lsdException w:name="Table Grid 1" w:semiHidden="1" w:unhideWhenUsed="1"/>
-    <w:lsdException w:name="Table Grid 2" w:semiHidden="1" w:unhideWhenUsed="1"/>
-    <w:lsdException w:name="Table Grid 3" w:semiHidden="1" w:unhideWhenUsed="1"/>
-    <w:lsdException w:name="Table Grid 4" w:semiHidden="1" w:unhideWhenUsed="1"/>
-    <w:lsdException w:name="Table Grid 5" w:semiHidden="1" w:unhideWhenUsed="1"/>
-    <w:lsdException w:name="Table Grid 6" w:semiHidden="1" w:unhideWhenUsed="1"/>
-    <w:lsdException w:name="Table Grid 7" w:semiHidden="1" w:unhideWhenUsed="1"/>
-    <w:lsdException w:name="Table Grid 8" w:semiHidden="1" w:unhideWhenUsed="1"/>
-    <w:lsdException w:name="Table List 1" w:semiHidden="1" w:unhideWhenUsed="1"/>
-    <w:lsdException w:name="Table List 2" w:semiHidden="1" w:unhideWhenUsed="1"/>
-    <w:lsdException w:name="Table List 3" w:semiHidden="1" w:unhideWhenUsed="1"/>
-    <w:lsdException w:name="Table List 4" w:semiHidden="1" w:unhideWhenUsed="1"/>
-    <w:lsdException w:name="Table List 5" w:semiHidden="1" w:unhideWhenUsed="1"/>
-    <w:lsdException w:name="Table List 6" w:semiHidden="1" w:unhideWhenUsed="1"/>
-    <w:lsdException w:name="Table List 7" w:semiHidden="1" w:unhideWhenUsed="1"/>
-    <w:lsdException w:name="Table List 8" w:semiHidden="1" w:unhideWhenUsed="1"/>
-    <w:lsdException w:name="Table 3D effects 1" w:semiHidden="1" w:unhideWhenUsed="1"/>
-    <w:lsdException w:name="Table 3D effects 2" w:semiHidden="1" w:unhideWhenUsed="1"/>
-    <w:lsdException w:name="Table 3D effects 3" w:semiHidden="1" w:unhideWhenUsed="1"/>
-    <w:lsdException w:name="Table Contemporary" w:semiHidden="1" w:unhideWhenUsed="1"/>
-    <w:lsdException w:name="Table Elegant" w:semiHidden="1" w:unhideWhenUsed="1"/>
-    <w:lsdException w:name="Table Professional" w:semiHidden="1" w:unhideWhenUsed="1"/>
-    <w:lsdException w:name="Table Subtle 1" w:semiHidden="1" w:unhideWhenUsed="1"/>
-    <w:lsdException w:name="Table Subtle 2" w:semiHidden="1" w:unhideWhenUsed="1"/>
-    <w:lsdException w:name="Table Web 1" w:semiHidden="1" w:unhideWhenUsed="1"/>
-    <w:lsdException w:name="Table Web 2" w:semiHidden="1" w:unhideWhenUsed="1"/>
-    <w:lsdException w:name="Table Web 3" w:semiHidden="1" w:unhideWhenUsed="1"/>
-    <w:lsdException w:name="Balloon Text" w:semiHidden="1" w:unhideWhenUsed="1"/>
-    <w:lsdException w:name="Table Grid" w:uiPriority="39"/>
-    <w:lsdException w:name="Table Theme" w:semiHidden="1" w:unhideWhenUsed="1"/>
-    <w:lsdException w:name="Placeholder Text" w:semiHidden="1"/>
-    <w:lsdException w:name="No Spacing" w:uiPriority="1" w:qFormat="1"/>
-    <w:lsdException w:name="Light Shading" w:uiPriority="60"/>
-    <w:lsdException w:name="Light List" w:uiPriority="61"/>
-    <w:lsdException w:name="Light Grid" w:uiPriority="62"/>
-    <w:lsdException w:name="Medium Shading 1" w:uiPriority="63"/>
-    <w:lsdException w:name="Medium Shading 2" w:uiPriority="64"/>
-    <w:lsdException w:name="Medium List 1" w:uiPriority="65"/>
-    <w:lsdException w:name="Medium List 2" w:uiPriority="66"/>
-    <w:lsdException w:name="Medium Grid 1" w:uiPriority="67"/>
-    <w:lsdException w:name="Medium Grid 2" w:uiPriority="68"/>
-    <w:lsdException w:name="Medium Grid 3" w:uiPriority="69"/>
-    <w:lsdException w:name="Dark List" w:uiPriority="70"/>
-    <w:lsdException w:name="Colorful Shading" w:uiPriority="71"/>
-    <w:lsdException w:name="Colorful List" w:uiPriority="72"/>
-    <w:lsdException w:name="Colorful Grid" w:uiPriority="73"/>
-    <w:lsdException w:name="Light Shading Accent 1" w:uiPriority="60"/>
-    <w:lsdException w:name="Light List Accent 1" w:uiPriority="61"/>
-    <w:lsdException w:name="Light Grid Accent 1" w:uiPriority="62"/>
-    <w:lsdException w:name="Medium Shading 1 Accent 1" w:uiPriority="63"/>
-    <w:lsdException w:name="Medium Shading 2 Accent 1" w:uiPriority="64"/>
-    <w:lsdException w:name="Medium List 1 Accent 1" w:uiPriority="65"/>
-    <w:lsdException w:name="Revision" w:semiHidden="1"/>
-    <w:lsdException w:name="List Paragraph" w:uiPriority="34" w:qFormat="1"/>
-    <w:lsdException w:name="Quote" w:uiPriority="29" w:qFormat="1"/>
-    <w:lsdException w:name="Intense Quote" w:uiPriority="30" w:qFormat="1"/>
-    <w:lsdException w:name="Medium List 2 Accent 1" w:uiPriority="66"/>
-    <w:lsdException w:name="Medium Grid 1 Accent 1" w:uiPriority="67"/>
-    <w:lsdException w:name="Medium Grid 2 Accent 1" w:uiPriority="68"/>
-    <w:lsdException w:name="Medium Grid 3 Accent 1" w:uiPriority="69"/>
-    <w:lsdException w:name="Dark List Accent 1" w:uiPriority="70"/>
-    <w:lsdException w:name="Colorful Shading Accent 1" w:uiPriority="71"/>
-    <w:lsdException w:name="Colorful List Accent 1" w:uiPriority="72"/>
-    <w:lsdException w:name="Colorful Grid Accent 1" w:uiPriority="73"/>
-    <w:lsdException w:name="Light Shading Accent 2" w:uiPriority="60"/>
-    <w:lsdException w:name="Light List Accent 2" w:uiPriority="61"/>
-    <w:lsdException w:name="Light Grid Accent 2" w:uiPriority="62"/>
-    <w:lsdException w:name="Medium Shading 1 Accent 2" w:uiPriority="63"/>
-    <w:lsdException w:name="Medium Shading 2 Accent 2" w:uiPriority="64"/>
-    <w:lsdException w:name="Medium List 1 Accent 2" w:uiPriority="65"/>
-    <w:lsdException w:name="Medium List 2 Accent 2" w:uiPriority="66"/>
-    <w:lsdException w:name="Medium Grid 1 Accent 2" w:uiPriority="67"/>
-    <w:lsdException w:name="Medium Grid 2 Accent 2" w:uiPriority="68"/>
-    <w:lsdException w:name="Medium Grid 3 Accent 2" w:uiPriority="69"/>
-    <w:lsdException w:name="Dark List Accent 2" w:uiPriority="70"/>
-    <w:lsdException w:name="Colorful Shading Accent 2" w:uiPriority="71"/>
-    <w:lsdException w:name="Colorful List Accent 2" w:uiPriority="72"/>
-    <w:lsdException w:name="Colorful Grid Accent 2" w:uiPriority="73"/>
-    <w:lsdException w:name="Light Shading Accent 3" w:uiPriority="60"/>
-    <w:lsdException w:name="Light List Accent 3" w:uiPriority="61"/>
-    <w:lsdException w:name="Light Grid Accent 3" w:uiPriority="62"/>
-    <w:lsdException w:name="Medium Shading 1 Accent 3" w:uiPriority="63"/>
-    <w:lsdException w:name="Medium Shading 2 Accent 3" w:uiPriority="64"/>
-    <w:lsdException w:name="Medium List 1 Accent 3" w:uiPriority="65"/>
-    <w:lsdException w:name="Medium List 2 Accent 3" w:uiPriority="66"/>
-    <w:lsdException w:name="Medium Grid 1 Accent 3" w:uiPriority="67"/>
-    <w:lsdException w:name="Medium Grid 2 Accent 3" w:uiPriority="68"/>
-    <w:lsdException w:name="Medium Grid 3 Accent 3" w:uiPriority="69"/>
-    <w:lsdException w:name="Dark List Accent 3" w:uiPriority="70"/>
-    <w:lsdException w:name="Colorful Shading Accent 3" w:uiPriority="71"/>
-    <w:lsdException w:name="Colorful List Accent 3" w:uiPriority="72"/>
-    <w:lsdException w:name="Colorful Grid Accent 3" w:uiPriority="73"/>
-    <w:lsdException w:name="Light Shading Accent 4" w:uiPriority="60"/>
-    <w:lsdException w:name="Light List Accent 4" w:uiPriority="61"/>
-    <w:lsdException w:name="Light Grid Accent 4" w:uiPriority="62"/>
-    <w:lsdException w:name="Medium Shading 1 Accent 4" w:uiPriority="63"/>
-    <w:lsdException w:name="Medium Shading 2 Accent 4" w:uiPriority="64"/>
-    <w:lsdException w:name="Medium List 1 Accent 4" w:uiPriority="65"/>
-    <w:lsdException w:name="Medium List 2 Accent 4" w:uiPriority="66"/>
-    <w:lsdException w:name="Medium Grid 1 Accent 4" w:uiPriority="67"/>
-    <w:lsdException w:name="Medium Grid 2 Accent 4" w:uiPriority="68"/>
-    <w:lsdException w:name="Medium Grid 3 Accent 4" w:uiPriority="69"/>
-    <w:lsdException w:name="Dark List Accent 4" w:uiPriority="70"/>
-    <w:lsdException w:name="Colorful Shading Accent 4" w:uiPriority="71"/>
-    <w:lsdException w:name="Colorful List Accent 4" w:uiPriority="72"/>
-    <w:lsdException w:name="Colorful Grid Accent 4" w:uiPriority="73"/>
-    <w:lsdException w:name="Light Shading Accent 5" w:uiPriority="60"/>
-    <w:lsdException w:name="Light List Accent 5" w:uiPriority="61"/>
-    <w:lsdException w:name="Light Grid Accent 5" w:uiPriority="62"/>
-    <w:lsdException w:name="Medium Shading 1 Accent 5" w:uiPriority="63"/>
-    <w:lsdException w:name="Medium Shading 2 Accent 5" w:uiPriority="64"/>
-    <w:lsdException w:name="Medium List 1 Accent 5" w:uiPriority="65"/>
-    <w:lsdException w:name="Medium List 2 Accent 5" w:uiPriority="66"/>
-    <w:lsdException w:name="Medium Grid 1 Accent 5" w:uiPriority="67"/>
-    <w:lsdException w:name="Medium Grid 2 Accent 5" w:uiPriority="68"/>
-    <w:lsdException w:name="Medium Grid 3 Accent 5" w:uiPriority="69"/>
-    <w:lsdException w:name="Dark List Accent 5" w:uiPriority="70"/>
-    <w:lsdException w:name="Colorful Shading Accent 5" w:uiPriority="71"/>
-    <w:lsdException w:name="Colorful List Accent 5" w:uiPriority="72"/>
-    <w:lsdException w:name="Colorful Grid Accent 5" w:uiPriority="73"/>
-    <w:lsdException w:name="Light Shading Accent 6" w:uiPriority="60"/>
-    <w:lsdException w:name="Light List Accent 6" w:uiPriority="61"/>
-    <w:lsdException w:name="Light Grid Accent 6" w:uiPriority="62"/>
-    <w:lsdException w:name="Medium Shading 1 Accent 6" w:uiPriority="63"/>
-    <w:lsdException w:name="Medium Shading 2 Accent 6" w:uiPriority="64"/>
-    <w:lsdException w:name="Medium List 1 Accent 6" w:uiPriority="65"/>
-    <w:lsdException w:name="Medium List 2 Accent 6" w:uiPriority="66"/>
-    <w:lsdException w:name="Medium Grid 1 Accent 6" w:uiPriority="67"/>
-    <w:lsdException w:name="Medium Grid 2 Accent 6" w:uiPriority="68"/>
-    <w:lsdException w:name="Medium Grid 3 Accent 6" w:uiPriority="69"/>
-    <w:lsdException w:name="Dark List Accent 6" w:uiPriority="70"/>
-    <w:lsdException w:name="Colorful Shading Accent 6" w:uiPriority="71"/>
-    <w:lsdException w:name="Colorful List Accent 6" w:uiPriority="72"/>
-    <w:lsdException w:name="Colorful Grid Accent 6" w:uiPriority="73"/>
-    <w:lsdException w:name="Subtle Emphasis" w:uiPriority="19" w:qFormat="1"/>
-    <w:lsdException w:name="Intense Emphasis" w:uiPriority="21" w:qFormat="1"/>
-    <w:lsdException w:name="Subtle Reference" w:uiPriority="31" w:qFormat="1"/>
-    <w:lsdException w:name="Intense Reference" w:uiPriority="32" w:qFormat="1"/>
-    <w:lsdException w:name="Book Title" w:uiPriority="33" w:qFormat="1"/>
-    <w:lsdException w:name="Bibliography" w:semiHidden="1" w:uiPriority="37" w:unhideWhenUsed="1"/>
-    <w:lsdException w:name="TOC Heading" w:semiHidden="1" w:uiPriority="39" w:unhideWhenUsed="1" w:qFormat="1"/>
-    <w:lsdException w:name="Plain Table 1" w:uiPriority="41"/>
-    <w:lsdException w:name="Plain Table 2" w:uiPriority="42"/>
-    <w:lsdException w:name="Plain Table 3" w:uiPriority="43"/>
-    <w:lsdException w:name="Plain Table 4" w:uiPriority="44"/>
-    <w:lsdException w:name="Plain Table 5" w:uiPriority="45"/>
-    <w:lsdException w:name="Grid Table Light" w:uiPriority="40"/>
-    <w:lsdException w:name="Grid Table 1 Light" w:uiPriority="46"/>
-    <w:lsdException w:name="Grid Table 2" w:uiPriority="47"/>
-    <w:lsdException w:name="Grid Table 3" w:uiPriority="48"/>
-    <w:lsdException w:name="Grid Table 4" w:uiPriority="49"/>
-    <w:lsdException w:name="Grid Table 5 Dark" w:uiPriority="50"/>
-    <w:lsdException w:name="Grid Table 6 Colorful" w:uiPriority="51"/>
-    <w:lsdException w:name="Grid Table 7 Colorful" w:uiPriority="52"/>
-    <w:lsdException w:name="Grid Table 1 Light Accent 1" w:uiPriority="46"/>
-    <w:lsdException w:name="Grid Table 2 Accent 1" w:uiPriority="47"/>
-    <w:lsdException w:name="Grid Table 3 Accent 1" w:uiPriority="48"/>
-    <w:lsdException w:name="Grid Table 4 Accent 1" w:uiPriority="49"/>
-    <w:lsdException w:name="Grid Table 5 Dark Accent 1" w:uiPriority="50"/>
-    <w:lsdException w:name="Grid Table 6 Colorful Accent 1" w:uiPriority="51"/>
-    <w:lsdException w:name="Grid Table 7 Colorful Accent 1" w:uiPriority="52"/>
-    <w:lsdException w:name="Grid Table 1 Light Accent 2" w:uiPriority="46"/>
-    <w:lsdException w:name="Grid Table 2 Accent 2" w:uiPriority="47"/>
-    <w:lsdException w:name="Grid Table 3 Accent 2" w:uiPriority="48"/>
-    <w:lsdException w:name="Grid Table 4 Accent 2" w:uiPriority="49"/>
-    <w:lsdException w:name="Grid Table 5 Dark Accent 2" w:uiPriority="50"/>
-    <w:lsdException w:name="Grid Table 6 Colorful Accent 2" w:uiPriority="51"/>
-    <w:lsdException w:name="Grid Table 7 Colorful Accent 2" w:uiPriority="52"/>
-    <w:lsdException w:name="Grid Table 1 Light Accent 3" w:uiPriority="46"/>
-    <w:lsdException w:name="Grid Table 2 Accent 3" w:uiPriority="47"/>
-    <w:lsdException w:name="Grid Table 3 Accent 3" w:uiPriority="48"/>
-    <w:lsdException w:name="Grid Table 4 Accent 3" w:uiPriority="49"/>
-    <w:lsdException w:name="Grid Table 5 Dark Accent 3" w:uiPriority="50"/>
-    <w:lsdException w:name="Grid Table 6 Colorful Accent 3" w:uiPriority="51"/>
-    <w:lsdException w:name="Grid Table 7 Colorful Accent 3" w:uiPriority="52"/>
-    <w:lsdException w:name="Grid Table 1 Light Accent 4" w:uiPriority="46"/>
-    <w:lsdException w:name="Grid Table 2 Accent 4" w:uiPriority="47"/>
-    <w:lsdException w:name="Grid Table 3 Accent 4" w:uiPriority="48"/>
-    <w:lsdException w:name="Grid Table 4 Accent 4" w:uiPriority="49"/>
-    <w:lsdException w:name="Grid Table 5 Dark Accent 4" w:uiPriority="50"/>
-    <w:lsdException w:name="Grid Table 6 Colorful Accent 4" w:uiPriority="51"/>
-    <w:lsdException w:name="Grid Table 7 Colorful Accent 4" w:uiPriority="52"/>
-    <w:lsdException w:name="Grid Table 1 Light Accent 5" w:uiPriority="46"/>
-    <w:lsdException w:name="Grid Table 2 Accent 5" w:uiPriority="47"/>
-    <w:lsdException w:name="Grid Table 3 Accent 5" w:uiPriority="48"/>
-    <w:lsdException w:name="Grid Table 4 Accent 5" w:uiPriority="49"/>
-    <w:lsdException w:name="Grid Table 5 Dark Accent 5" w:uiPriority="50"/>
-    <w:lsdException w:name="Grid Table 6 Colorful Accent 5" w:uiPriority="51"/>
-    <w:lsdException w:name="Grid Table 7 Colorful Accent 5" w:uiPriority="52"/>
-    <w:lsdException w:name="Grid Table 1 Light Accent 6" w:uiPriority="46"/>
-    <w:lsdException w:name="Grid Table 2 Accent 6" w:uiPriority="47"/>
-    <w:lsdException w:name="Grid Table 3 Accent 6" w:uiPriority="48"/>
-    <w:lsdException w:name="Grid Table 4 Accent 6" w:uiPriority="49"/>
-    <w:lsdException w:name="Grid Table 5 Dark Accent 6" w:uiPriority="50"/>
-    <w:lsdException w:name="Grid Table 6 Colorful Accent 6" w:uiPriority="51"/>
-    <w:lsdException w:name="Grid Table 7 Colorful Accent 6" w:uiPriority="52"/>
-    <w:lsdException w:name="List Table 1 Light" w:uiPriority="46"/>
-    <w:lsdException w:name="List Table 2" w:uiPriority="47"/>
-    <w:lsdException w:name="List Table 3" w:uiPriority="48"/>
-    <w:lsdException w:name="List Table 4" w:uiPriority="49"/>
-    <w:lsdException w:name="List Table 5 Dark" w:uiPriority="50"/>
-    <w:lsdException w:name="List Table 6 Colorful" w:uiPriority="51"/>
-    <w:lsdException w:name="List Table 7 Colorful" w:uiPriority="52"/>
-    <w:lsdException w:name="List Table 1 Light Accent 1" w:uiPriority="46"/>
-    <w:lsdException w:name="List Table 2 Accent 1" w:uiPriority="47"/>
-    <w:lsdException w:name="List Table 3 Accent 1" w:uiPriority="48"/>
-    <w:lsdException w:name="List Table 4 Accent 1" w:uiPriority="49"/>
-    <w:lsdException w:name="List Table 5 Dark Accent 1" w:uiPriority="50"/>
-    <w:lsdException w:name="List Table 6 Colorful Accent 1" w:uiPriority="51"/>
-    <w:lsdException w:name="List Table 7 Colorful Accent 1" w:uiPriority="52"/>
-    <w:lsdException w:name="List Table 1 Light Accent 2" w:uiPriority="46"/>
-    <w:lsdException w:name="List Table 2 Accent 2" w:uiPriority="47"/>
-    <w:lsdException w:name="List Table 3 Accent 2" w:uiPriority="48"/>
-    <w:lsdException w:name="List Table 4 Accent 2" w:uiPriority="49"/>
-    <w:lsdException w:name="List Table 5 Dark Accent 2" w:uiPriority="50"/>
-    <w:lsdException w:name="List Table 6 Colorful Accent 2" w:uiPriority="51"/>
-    <w:lsdException w:name="List Table 7 Colorful Accent 2" w:uiPriority="52"/>
-    <w:lsdException w:name="List Table 1 Light Accent 3" w:uiPriority="46"/>
-    <w:lsdException w:name="List Table 2 Accent 3" w:uiPriority="47"/>
-    <w:lsdException w:name="List Table 3 Accent 3" w:uiPriority="48"/>
-    <w:lsdException w:name="List Table 4 Accent 3" w:uiPriority="49"/>
-    <w:lsdException w:name="List Table 5 Dark Accent 3" w:uiPriority="50"/>
-    <w:lsdException w:name="List Table 6 Colorful Accent 3" w:uiPriority="51"/>
-    <w:lsdException w:name="List Table 7 Colorful Accent 3" w:uiPriority="52"/>
-    <w:lsdException w:name="List Table 1 Light Accent 4" w:uiPriority="46"/>
-    <w:lsdException w:name="List Table 2 Accent 4" w:uiPriority="47"/>
-    <w:lsdException w:name="List Table 3 Accent 4" w:uiPriority="48"/>
-    <w:lsdException w:name="List Table 4 Accent 4" w:uiPriority="49"/>
-    <w:lsdException w:name="List Table 5 Dark Accent 4" w:uiPriority="50"/>
-    <w:lsdException w:name="List Table 6 Colorful Accent 4" w:uiPriority="51"/>
-    <w:lsdException w:name="List Table 7 Colorful Accent 4" w:uiPriority="52"/>
-    <w:lsdException w:name="List Table 1 Light Accent 5" w:uiPriority="46"/>
-    <w:lsdException w:name="List Table 2 Accent 5" w:uiPriority="47"/>
-    <w:lsdException w:name="List Table 3 Accent 5" w:uiPriority="48"/>
-    <w:lsdException w:name="List Table 4 Accent 5" w:uiPriority="49"/>
-    <w:lsdException w:name="List Table 5 Dark Accent 5" w:uiPriority="50"/>
-    <w:lsdException w:name="List Table 6 Colorful Accent 5" w:uiPriority="51"/>
-    <w:lsdException w:name="List Table 7 Colorful Accent 5" w:uiPriority="52"/>
-    <w:lsdException w:name="List Table 1 Light Accent 6" w:uiPriority="46"/>
-    <w:lsdException w:name="List Table 2 Accent 6" w:uiPriority="47"/>
-    <w:lsdException w:name="List Table 3 Accent 6" w:uiPriority="48"/>
-    <w:lsdException w:name="List Table 4 Accent 6" w:uiPriority="49"/>
-    <w:lsdException w:name="List Table 5 Dark Accent 6" w:uiPriority="50"/>
-    <w:lsdException w:name="List Table 6 Colorful Accent 6" w:uiPriority="51"/>
-    <w:lsdException w:name="List Table 7 Colorful Accent 6" w:uiPriority="52"/>
-  </w:latentStyles>
-  <w:style w:type="paragraph" w:default="1" w:styleId="Normal">
-    <w:name w:val="Normal"/>
-    <w:qFormat/>
-  </w:style>
-  <w:style w:type="paragraph" w:styleId="Ttulo1">
-    <w:name w:val="heading 1"/>
-    <w:basedOn w:val="Normal"/>
-    <w:next w:val="Normal"/>
-    <w:link w:val="Ttulo1Char"/>
-    <w:uiPriority w:val="9"/>
-    <w:qFormat/>
-    <w:rsid w:val="00BD0827"/>
-    <w:pPr>
-      <w:keepNext/>
-      <w:keepLines/>
-      <w:spacing w:before="240" w:after="0"/>
-      <w:outlineLvl w:val="0"/>
-    </w:pPr>
-    <w:rPr>
-      <w:rFonts w:asciiTheme="majorHAnsi" w:eastAsiaTheme="majorEastAsia" w:hAnsiTheme="majorHAnsi" w:cstheme="majorBidi"/>
-      <w:color w:val="2E74B5" w:themeColor="accent1" w:themeShade="BF"/>
-      <w:sz w:val="32"/>
-      <w:szCs w:val="32"/>
-    </w:rPr>
-  </w:style>
-  <w:style w:type="paragraph" w:styleId="Ttulo2">
-    <w:name w:val="heading 2"/>
-    <w:basedOn w:val="Normal"/>
-    <w:next w:val="Normal"/>
-    <w:link w:val="Ttulo2Char"/>
-    <w:uiPriority w:val="9"/>
-    <w:unhideWhenUsed/>
-    <w:qFormat/>
-    <w:rsid w:val="00BD0827"/>
-    <w:pPr>
-      <w:keepNext/>
-      <w:keepLines/>
-      <w:spacing w:before="40" w:after="0"/>
-      <w:outlineLvl w:val="1"/>
-    </w:pPr>
-    <w:rPr>
-      <w:rFonts w:asciiTheme="majorHAnsi" w:eastAsiaTheme="majorEastAsia" w:hAnsiTheme="majorHAnsi" w:cstheme="majorBidi"/>
-      <w:color w:val="2E74B5" w:themeColor="accent1" w:themeShade="BF"/>
-      <w:sz w:val="26"/>
-      <w:szCs w:val="26"/>
-    </w:rPr>
-  </w:style>
-  <w:style w:type="paragraph" w:styleId="Ttulo3">
-    <w:name w:val="heading 3"/>
-    <w:basedOn w:val="Normal"/>
-    <w:next w:val="Normal"/>
-    <w:link w:val="Ttulo3Char"/>
-    <w:uiPriority w:val="9"/>
-    <w:unhideWhenUsed/>
-    <w:qFormat/>
-    <w:rsid w:val="00BD0827"/>
-    <w:pPr>
-      <w:keepNext/>
-      <w:keepLines/>
-      <w:spacing w:before="40" w:after="0"/>
-      <w:outlineLvl w:val="2"/>
-    </w:pPr>
-    <w:rPr>
-      <w:rFonts w:asciiTheme="majorHAnsi" w:eastAsiaTheme="majorEastAsia" w:hAnsiTheme="majorHAnsi" w:cstheme="majorBidi"/>
-      <w:color w:val="1F4D78" w:themeColor="accent1" w:themeShade="7F"/>
-      <w:sz w:val="24"/>
-      <w:szCs w:val="24"/>
-    </w:rPr>
-  </w:style>
-  <w:style w:type="character" w:default="1" w:styleId="Fontepargpadro">
-    <w:name w:val="Default Paragraph Font"/>
-    <w:uiPriority w:val="1"/>
-    <w:semiHidden/>
-    <w:unhideWhenUsed/>
-  </w:style>
-  <w:style w:type="table" w:default="1" w:styleId="Tabelanormal">
-    <w:name w:val="Normal Table"/>
-    <w:uiPriority w:val="99"/>
-    <w:semiHidden/>
-    <w:unhideWhenUsed/>
-    <w:tblPr>
-      <w:tblInd w:w="0" w:type="dxa"/>
-      <w:tblCellMar>
-        <w:top w:w="0" w:type="dxa"/>
-        <w:left w:w="108" w:type="dxa"/>
-        <w:bottom w:w="0" w:type="dxa"/>
-        <w:right w:w="108" w:type="dxa"/>
-      </w:tblCellMar>
-    </w:tblPr>
-  </w:style>
-  <w:style w:type="numbering" w:default="1" w:styleId="Semlista">
-    <w:name w:val="No List"/>
-    <w:uiPriority w:val="99"/>
-    <w:semiHidden/>
-    <w:unhideWhenUsed/>
-  </w:style>
-  <w:style w:type="character" w:customStyle="1" w:styleId="Ttulo1Char">
-    <w:name w:val="Título 1 Char"/>
-    <w:basedOn w:val="Fontepargpadro"/>
-    <w:link w:val="Ttulo1"/>
-    <w:uiPriority w:val="9"/>
-    <w:rsid w:val="00BD0827"/>
-    <w:rPr>
-      <w:rFonts w:asciiTheme="majorHAnsi" w:eastAsiaTheme="majorEastAsia" w:hAnsiTheme="majorHAnsi" w:cstheme="majorBidi"/>
-      <w:color w:val="2E74B5" w:themeColor="accent1" w:themeShade="BF"/>
-      <w:sz w:val="32"/>
-      <w:szCs w:val="32"/>
-    </w:rPr>
-  </w:style>
-  <w:style w:type="paragraph" w:styleId="Subttulo">
-    <w:name w:val="Subtitle"/>
-    <w:basedOn w:val="Normal"/>
-    <w:next w:val="Normal"/>
-    <w:link w:val="SubttuloChar"/>
-    <w:uiPriority w:val="11"/>
-    <w:qFormat/>
-    <w:rsid w:val="00BD0827"/>
-    <w:pPr>
-      <w:numPr>
-        <w:ilvl w:val="1"/>
-      </w:numPr>
-    </w:pPr>
-    <w:rPr>
-      <w:rFonts w:eastAsiaTheme="minorEastAsia"/>
-      <w:color w:val="5A5A5A" w:themeColor="text1" w:themeTint="A5"/>
-      <w:spacing w:val="15"/>
-    </w:rPr>
-  </w:style>
-  <w:style w:type="character" w:customStyle="1" w:styleId="SubttuloChar">
-    <w:name w:val="Subtítulo Char"/>
-    <w:basedOn w:val="Fontepargpadro"/>
-    <w:link w:val="Subttulo"/>
-    <w:uiPriority w:val="11"/>
-    <w:rsid w:val="00BD0827"/>
-    <w:rPr>
-      <w:rFonts w:eastAsiaTheme="minorEastAsia"/>
-      <w:color w:val="5A5A5A" w:themeColor="text1" w:themeTint="A5"/>
-      <w:spacing w:val="15"/>
-    </w:rPr>
-  </w:style>
-  <w:style w:type="character" w:customStyle="1" w:styleId="Ttulo2Char">
-    <w:name w:val="Título 2 Char"/>
-    <w:basedOn w:val="Fontepargpadro"/>
-    <w:link w:val="Ttulo2"/>
-    <w:uiPriority w:val="9"/>
-    <w:rsid w:val="00BD0827"/>
-    <w:rPr>
-      <w:rFonts w:asciiTheme="majorHAnsi" w:eastAsiaTheme="majorEastAsia" w:hAnsiTheme="majorHAnsi" w:cstheme="majorBidi"/>
-      <w:color w:val="2E74B5" w:themeColor="accent1" w:themeShade="BF"/>
-      <w:sz w:val="26"/>
-      <w:szCs w:val="26"/>
-    </w:rPr>
-  </w:style>
-  <w:style w:type="character" w:customStyle="1" w:styleId="Ttulo3Char">
-    <w:name w:val="Título 3 Char"/>
-    <w:basedOn w:val="Fontepargpadro"/>
-    <w:link w:val="Ttulo3"/>
-    <w:uiPriority w:val="9"/>
-    <w:rsid w:val="00BD0827"/>
-    <w:rPr>
-      <w:rFonts w:asciiTheme="majorHAnsi" w:eastAsiaTheme="majorEastAsia" w:hAnsiTheme="majorHAnsi" w:cstheme="majorBidi"/>
-      <w:color w:val="1F4D78" w:themeColor="accent1" w:themeShade="7F"/>
-      <w:sz w:val="24"/>
-      <w:szCs w:val="24"/>
-    </w:rPr>
-  </w:style>
-  <w:style w:type="character" w:styleId="Hyperlink">
-    <w:name w:val="Hyperlink"/>
-    <w:basedOn w:val="Fontepargpadro"/>
-    <w:uiPriority w:val="99"/>
-    <w:semiHidden/>
-    <w:unhideWhenUsed/>
-    <w:rsid w:val="002C0D63"/>
-    <w:rPr>
-      <w:color w:val="0000FF"/>
-      <w:u w:val="single"/>
-    </w:rPr>
-  </w:style>
-</w:styles>
 </file>
 
 <file path=word/theme/theme1.xml><?xml version="1.0" encoding="utf-8"?>

</xml_diff>